<commit_message>
feat: 桌面版 v0.12.0 追平 Web（E1 完成）
G-DIST-1 关闭：重打桌面包并解包 app.asar 逐条核实七个版本的特征串——
v0.6 桌面入口 / v0.8 悬浮球主操作与 actor 配色 / v0.9 三列自适应 /
v0.10 标注牌与路径线 / v0.11 健康自检 / v0.12 版本徽标，全部存在；
包内零 CDN 引用、vendor 内置 1.2MB、打包产物 SMOKE_OK。

核实方法坑（已写进 Gap 文档附录 D）：@electron/asar extract-file 不往 stdout
输出（写文件到当前目录），拿它 grep 会得到"七项特性全部缺失"的假阴性；
正确做法是 asar extract 解包到临时目录再 grep。

下载页按 v0.12.0 重生成（含三件 SHA-256）；产物归档 releases/v0.12.0_2026-08-04
与 ~/Downloads。文档同步：Gap 附录 D 记录 E1 关闭，规格说明书平台差异表
桌面列全部转绿、KI-2 标记已修复。

Co-Authored-By: Claude Opus 5 <noreply@anthropic.com>
</commit_message>
<xml_diff>
--- a/docs/旅客旅程模拟器-Gap分析与演进规划-v1.0.docx
+++ b/docs/旅客旅程模拟器-Gap分析与演进规划-v1.0.docx
@@ -11245,7 +11245,7 @@
           </w:tcPr>
           <w:p>
             <w:r>
-              <w:t xml:space="preserve">未启动</w:t>
+              <w:t xml:space="preserve">已关闭 v0.12</w:t>
             </w:r>
           </w:p>
         </w:tc>
@@ -11382,7 +11382,7 @@
           </w:tcPr>
           <w:p>
             <w:r>
-              <w:t xml:space="preserve">未启动</w:t>
+              <w:t xml:space="preserve">已关闭 v0.12</w:t>
             </w:r>
           </w:p>
         </w:tc>
@@ -12067,7 +12067,7 @@
           </w:tcPr>
           <w:p>
             <w:r>
-              <w:t xml:space="preserve">未启动</w:t>
+              <w:t xml:space="preserve">已关闭 v0.12</w:t>
             </w:r>
           </w:p>
         </w:tc>
@@ -12341,7 +12341,7 @@
           </w:tcPr>
           <w:p>
             <w:r>
-              <w:t xml:space="preserve">未启动</w:t>
+              <w:t xml:space="preserve">已关闭 v0.12</w:t>
             </w:r>
           </w:p>
         </w:tc>
@@ -13552,6 +13552,465 @@
       </w:r>
       <w:r>
         <w:t xml:space="preserve">，会被我们自己的自检正确拦下——冒烟必须用 `--use-gl=angle --use-angle=swiftshader --enable-unsafe-swiftshader`，否则测的是「自检生效」而不是产品本身。</w:t>
+      </w:r>
+    </w:p>
+    <w:p/>
+    <w:p>
+      <w:pPr>
+        <w:pStyle w:val="Heading2"/>
+      </w:pPr>
+      <w:r>
+        <w:t xml:space="preserve">附录 D E1 关闭记录（2026-08-04，v0.12）</w:t>
+      </w:r>
+    </w:p>
+    <w:p/>
+    <w:p>
+      <w:r>
+        <w:t xml:space="preserve">E1「分发与版本可见」四条 Gap 按验收关闭。入口条件（E0 出口达成）已满足。</w:t>
+      </w:r>
+    </w:p>
+    <w:p/>
+    <w:tbl>
+      <w:tblPr>
+        <w:tblW w:type="dxa" w:w="9360"/>
+        <w:tblBorders>
+          <w:top w:val="single" w:color="auto" w:sz="4"/>
+          <w:left w:val="single" w:color="auto" w:sz="4"/>
+          <w:bottom w:val="single" w:color="auto" w:sz="4"/>
+          <w:right w:val="single" w:color="auto" w:sz="4"/>
+          <w:insideH w:val="single" w:color="auto" w:sz="4"/>
+          <w:insideV w:val="single" w:color="auto" w:sz="4"/>
+        </w:tblBorders>
+      </w:tblPr>
+      <w:tblGrid>
+        <w:gridCol w:w="748"/>
+        <w:gridCol w:w="3116"/>
+        <w:gridCol w:w="5496"/>
+      </w:tblGrid>
+      <w:tr>
+        <w:trPr>
+          <w:tblHeader/>
+        </w:trPr>
+        <w:tc>
+          <w:tcPr>
+            <w:tcW w:type="dxa" w:w="748"/>
+            <w:tcBorders>
+              <w:top w:val="single" w:color="BBBBBB" w:sz="1"/>
+              <w:left w:val="single" w:color="BBBBBB" w:sz="1"/>
+              <w:bottom w:val="single" w:color="BBBBBB" w:sz="1"/>
+              <w:right w:val="single" w:color="BBBBBB" w:sz="1"/>
+            </w:tcBorders>
+            <w:shd w:fill="D5E8F0" w:color="auto" w:val="clear"/>
+            <w:tcMar>
+              <w:top w:type="dxa" w:w="60"/>
+              <w:left w:type="dxa" w:w="100"/>
+              <w:bottom w:type="dxa" w:w="60"/>
+              <w:right w:type="dxa" w:w="100"/>
+            </w:tcMar>
+          </w:tcPr>
+          <w:p>
+            <w:r>
+              <w:rPr>
+                <w:b/>
+                <w:bCs/>
+              </w:rPr>
+              <w:t xml:space="preserve">Gap</w:t>
+            </w:r>
+          </w:p>
+        </w:tc>
+        <w:tc>
+          <w:tcPr>
+            <w:tcW w:type="dxa" w:w="3116"/>
+            <w:tcBorders>
+              <w:top w:val="single" w:color="BBBBBB" w:sz="1"/>
+              <w:left w:val="single" w:color="BBBBBB" w:sz="1"/>
+              <w:bottom w:val="single" w:color="BBBBBB" w:sz="1"/>
+              <w:right w:val="single" w:color="BBBBBB" w:sz="1"/>
+            </w:tcBorders>
+            <w:shd w:fill="D5E8F0" w:color="auto" w:val="clear"/>
+            <w:tcMar>
+              <w:top w:type="dxa" w:w="60"/>
+              <w:left w:type="dxa" w:w="100"/>
+              <w:bottom w:type="dxa" w:w="60"/>
+              <w:right w:type="dxa" w:w="100"/>
+            </w:tcMar>
+          </w:tcPr>
+          <w:p>
+            <w:r>
+              <w:rPr>
+                <w:b/>
+                <w:bCs/>
+              </w:rPr>
+              <w:t xml:space="preserve">验收执行方式</w:t>
+            </w:r>
+          </w:p>
+        </w:tc>
+        <w:tc>
+          <w:tcPr>
+            <w:tcW w:type="dxa" w:w="5496"/>
+            <w:tcBorders>
+              <w:top w:val="single" w:color="BBBBBB" w:sz="1"/>
+              <w:left w:val="single" w:color="BBBBBB" w:sz="1"/>
+              <w:bottom w:val="single" w:color="BBBBBB" w:sz="1"/>
+              <w:right w:val="single" w:color="BBBBBB" w:sz="1"/>
+            </w:tcBorders>
+            <w:shd w:fill="D5E8F0" w:color="auto" w:val="clear"/>
+            <w:tcMar>
+              <w:top w:type="dxa" w:w="60"/>
+              <w:left w:type="dxa" w:w="100"/>
+              <w:bottom w:type="dxa" w:w="60"/>
+              <w:right w:type="dxa" w:w="100"/>
+            </w:tcMar>
+          </w:tcPr>
+          <w:p>
+            <w:r>
+              <w:rPr>
+                <w:b/>
+                <w:bCs/>
+              </w:rPr>
+              <w:t xml:space="preserve">结果</w:t>
+            </w:r>
+          </w:p>
+        </w:tc>
+      </w:tr>
+      <w:tr>
+        <w:trPr>
+          <w:tblHeader w:val="false"/>
+        </w:trPr>
+        <w:tc>
+          <w:tcPr>
+            <w:tcW w:type="dxa" w:w="748"/>
+            <w:tcBorders>
+              <w:top w:val="single" w:color="BBBBBB" w:sz="1"/>
+              <w:left w:val="single" w:color="BBBBBB" w:sz="1"/>
+              <w:bottom w:val="single" w:color="BBBBBB" w:sz="1"/>
+              <w:right w:val="single" w:color="BBBBBB" w:sz="1"/>
+            </w:tcBorders>
+            <w:tcMar>
+              <w:top w:type="dxa" w:w="60"/>
+              <w:left w:type="dxa" w:w="100"/>
+              <w:bottom w:type="dxa" w:w="60"/>
+              <w:right w:type="dxa" w:w="100"/>
+            </w:tcMar>
+          </w:tcPr>
+          <w:p>
+            <w:r>
+              <w:t xml:space="preserve">G-DIST-1</w:t>
+            </w:r>
+          </w:p>
+        </w:tc>
+        <w:tc>
+          <w:tcPr>
+            <w:tcW w:type="dxa" w:w="3116"/>
+            <w:tcBorders>
+              <w:top w:val="single" w:color="BBBBBB" w:sz="1"/>
+              <w:left w:val="single" w:color="BBBBBB" w:sz="1"/>
+              <w:bottom w:val="single" w:color="BBBBBB" w:sz="1"/>
+              <w:right w:val="single" w:color="BBBBBB" w:sz="1"/>
+            </w:tcBorders>
+            <w:tcMar>
+              <w:top w:type="dxa" w:w="60"/>
+              <w:left w:type="dxa" w:w="100"/>
+              <w:bottom w:type="dxa" w:w="60"/>
+              <w:right w:type="dxa" w:w="100"/>
+            </w:tcMar>
+          </w:tcPr>
+          <w:p>
+            <w:r>
+              <w:t xml:space="preserve">重打桌面包后解包 app.asar，逐条 grep 七个版本的特征串</w:t>
+            </w:r>
+          </w:p>
+        </w:tc>
+        <w:tc>
+          <w:tcPr>
+            <w:tcW w:type="dxa" w:w="5496"/>
+            <w:tcBorders>
+              <w:top w:val="single" w:color="BBBBBB" w:sz="1"/>
+              <w:left w:val="single" w:color="BBBBBB" w:sz="1"/>
+              <w:bottom w:val="single" w:color="BBBBBB" w:sz="1"/>
+              <w:right w:val="single" w:color="BBBBBB" w:sz="1"/>
+            </w:tcBorders>
+            <w:tcMar>
+              <w:top w:type="dxa" w:w="60"/>
+              <w:left w:type="dxa" w:w="100"/>
+              <w:bottom w:type="dxa" w:w="60"/>
+              <w:right w:type="dxa" w:w="100"/>
+            </w:tcMar>
+          </w:tcPr>
+          <w:p>
+            <w:r>
+              <w:t xml:space="preserve">v0.6 桌面入口 / v0.8 悬浮球主操作与 actor 配色 / v0.9 三列自适应 / v0.10 标注牌与路径线 / v0.11 健康自检 / v0.12 版本徽标——</w:t>
+            </w:r>
+            <w:r>
+              <w:rPr>
+                <w:b/>
+                <w:bCs/>
+              </w:rPr>
+              <w:t xml:space="preserve">七项全部存在</w:t>
+            </w:r>
+            <w:r>
+              <w:t xml:space="preserve">；包内零 CDN 引用，vendor 内置 1.2MB；打包产物 SMOKE_OK</w:t>
+            </w:r>
+          </w:p>
+        </w:tc>
+      </w:tr>
+      <w:tr>
+        <w:trPr>
+          <w:tblHeader w:val="false"/>
+        </w:trPr>
+        <w:tc>
+          <w:tcPr>
+            <w:tcW w:type="dxa" w:w="748"/>
+            <w:tcBorders>
+              <w:top w:val="single" w:color="BBBBBB" w:sz="1"/>
+              <w:left w:val="single" w:color="BBBBBB" w:sz="1"/>
+              <w:bottom w:val="single" w:color="BBBBBB" w:sz="1"/>
+              <w:right w:val="single" w:color="BBBBBB" w:sz="1"/>
+            </w:tcBorders>
+            <w:tcMar>
+              <w:top w:type="dxa" w:w="60"/>
+              <w:left w:type="dxa" w:w="100"/>
+              <w:bottom w:type="dxa" w:w="60"/>
+              <w:right w:type="dxa" w:w="100"/>
+            </w:tcMar>
+          </w:tcPr>
+          <w:p>
+            <w:r>
+              <w:t xml:space="preserve">G-DIST-2</w:t>
+            </w:r>
+          </w:p>
+        </w:tc>
+        <w:tc>
+          <w:tcPr>
+            <w:tcW w:type="dxa" w:w="3116"/>
+            <w:tcBorders>
+              <w:top w:val="single" w:color="BBBBBB" w:sz="1"/>
+              <w:left w:val="single" w:color="BBBBBB" w:sz="1"/>
+              <w:bottom w:val="single" w:color="BBBBBB" w:sz="1"/>
+              <w:right w:val="single" w:color="BBBBBB" w:sz="1"/>
+            </w:tcBorders>
+            <w:tcMar>
+              <w:top w:type="dxa" w:w="60"/>
+              <w:left w:type="dxa" w:w="100"/>
+              <w:bottom w:type="dxa" w:w="60"/>
+              <w:right w:type="dxa" w:w="100"/>
+            </w:tcMar>
+          </w:tcPr>
+          <w:p>
+            <w:r>
+              <w:t xml:space="preserve">无头浏览器读徽标文本并切换语言</w:t>
+            </w:r>
+          </w:p>
+        </w:tc>
+        <w:tc>
+          <w:tcPr>
+            <w:tcW w:type="dxa" w:w="5496"/>
+            <w:tcBorders>
+              <w:top w:val="single" w:color="BBBBBB" w:sz="1"/>
+              <w:left w:val="single" w:color="BBBBBB" w:sz="1"/>
+              <w:bottom w:val="single" w:color="BBBBBB" w:sz="1"/>
+              <w:right w:val="single" w:color="BBBBBB" w:sz="1"/>
+            </w:tcBorders>
+            <w:tcMar>
+              <w:top w:type="dxa" w:w="60"/>
+              <w:left w:type="dxa" w:w="100"/>
+              <w:bottom w:type="dxa" w:w="60"/>
+              <w:right w:type="dxa" w:w="100"/>
+            </w:tcMar>
+          </w:tcPr>
+          <w:p>
+            <w:r>
+              <w:t xml:space="preserve">中文「v0.12 · 内容基线 2026-08-04」，英文「v0.12 · Content baseline 2026-08-04」，EN 无中文残留；版本号由 gen-importmap 写入 build-info.js 单一来源</w:t>
+            </w:r>
+          </w:p>
+        </w:tc>
+      </w:tr>
+      <w:tr>
+        <w:trPr>
+          <w:tblHeader w:val="false"/>
+        </w:trPr>
+        <w:tc>
+          <w:tcPr>
+            <w:tcW w:type="dxa" w:w="748"/>
+            <w:tcBorders>
+              <w:top w:val="single" w:color="BBBBBB" w:sz="1"/>
+              <w:left w:val="single" w:color="BBBBBB" w:sz="1"/>
+              <w:bottom w:val="single" w:color="BBBBBB" w:sz="1"/>
+              <w:right w:val="single" w:color="BBBBBB" w:sz="1"/>
+            </w:tcBorders>
+            <w:tcMar>
+              <w:top w:type="dxa" w:w="60"/>
+              <w:left w:type="dxa" w:w="100"/>
+              <w:bottom w:type="dxa" w:w="60"/>
+              <w:right w:type="dxa" w:w="100"/>
+            </w:tcMar>
+          </w:tcPr>
+          <w:p>
+            <w:r>
+              <w:t xml:space="preserve">G-ENG-1</w:t>
+            </w:r>
+          </w:p>
+        </w:tc>
+        <w:tc>
+          <w:tcPr>
+            <w:tcW w:type="dxa" w:w="3116"/>
+            <w:tcBorders>
+              <w:top w:val="single" w:color="BBBBBB" w:sz="1"/>
+              <w:left w:val="single" w:color="BBBBBB" w:sz="1"/>
+              <w:bottom w:val="single" w:color="BBBBBB" w:sz="1"/>
+              <w:right w:val="single" w:color="BBBBBB" w:sz="1"/>
+            </w:tcBorders>
+            <w:tcMar>
+              <w:top w:type="dxa" w:w="60"/>
+              <w:left w:type="dxa" w:w="100"/>
+              <w:bottom w:type="dxa" w:w="60"/>
+              <w:right w:type="dxa" w:w="100"/>
+            </w:tcMar>
+          </w:tcPr>
+          <w:p>
+            <w:r>
+              <w:t xml:space="preserve">建立 .github/workflows/ci.yml</w:t>
+            </w:r>
+          </w:p>
+        </w:tc>
+        <w:tc>
+          <w:tcPr>
+            <w:tcW w:type="dxa" w:w="5496"/>
+            <w:tcBorders>
+              <w:top w:val="single" w:color="BBBBBB" w:sz="1"/>
+              <w:left w:val="single" w:color="BBBBBB" w:sz="1"/>
+              <w:bottom w:val="single" w:color="BBBBBB" w:sz="1"/>
+              <w:right w:val="single" w:color="BBBBBB" w:sz="1"/>
+            </w:tcBorders>
+            <w:tcMar>
+              <w:top w:type="dxa" w:w="60"/>
+              <w:left w:type="dxa" w:w="100"/>
+              <w:bottom w:type="dxa" w:w="60"/>
+              <w:right w:type="dxa" w:w="100"/>
+            </w:tcMar>
+          </w:tcPr>
+          <w:p>
+            <w:r>
+              <w:t xml:space="preserve">每次 push/PR 跑：数据契约校验 → npm ci → 无头冒烟 → CDN 残留检查</w:t>
+            </w:r>
+          </w:p>
+        </w:tc>
+      </w:tr>
+      <w:tr>
+        <w:trPr>
+          <w:tblHeader w:val="false"/>
+        </w:trPr>
+        <w:tc>
+          <w:tcPr>
+            <w:tcW w:type="dxa" w:w="748"/>
+            <w:tcBorders>
+              <w:top w:val="single" w:color="BBBBBB" w:sz="1"/>
+              <w:left w:val="single" w:color="BBBBBB" w:sz="1"/>
+              <w:bottom w:val="single" w:color="BBBBBB" w:sz="1"/>
+              <w:right w:val="single" w:color="BBBBBB" w:sz="1"/>
+            </w:tcBorders>
+            <w:tcMar>
+              <w:top w:type="dxa" w:w="60"/>
+              <w:left w:type="dxa" w:w="100"/>
+              <w:bottom w:type="dxa" w:w="60"/>
+              <w:right w:type="dxa" w:w="100"/>
+            </w:tcMar>
+          </w:tcPr>
+          <w:p>
+            <w:r>
+              <w:t xml:space="preserve">G-ENG-3</w:t>
+            </w:r>
+          </w:p>
+        </w:tc>
+        <w:tc>
+          <w:tcPr>
+            <w:tcW w:type="dxa" w:w="3116"/>
+            <w:tcBorders>
+              <w:top w:val="single" w:color="BBBBBB" w:sz="1"/>
+              <w:left w:val="single" w:color="BBBBBB" w:sz="1"/>
+              <w:bottom w:val="single" w:color="BBBBBB" w:sz="1"/>
+              <w:right w:val="single" w:color="BBBBBB" w:sz="1"/>
+            </w:tcBorders>
+            <w:tcMar>
+              <w:top w:type="dxa" w:w="60"/>
+              <w:left w:type="dxa" w:w="100"/>
+              <w:bottom w:type="dxa" w:w="60"/>
+              <w:right w:type="dxa" w:w="100"/>
+            </w:tcMar>
+          </w:tcPr>
+          <w:p>
+            <w:r>
+              <w:t xml:space="preserve">v0.11 起打 tag</w:t>
+            </w:r>
+          </w:p>
+        </w:tc>
+        <w:tc>
+          <w:tcPr>
+            <w:tcW w:type="dxa" w:w="5496"/>
+            <w:tcBorders>
+              <w:top w:val="single" w:color="BBBBBB" w:sz="1"/>
+              <w:left w:val="single" w:color="BBBBBB" w:sz="1"/>
+              <w:bottom w:val="single" w:color="BBBBBB" w:sz="1"/>
+              <w:right w:val="single" w:color="BBBBBB" w:sz="1"/>
+            </w:tcBorders>
+            <w:tcMar>
+              <w:top w:type="dxa" w:w="60"/>
+              <w:left w:type="dxa" w:w="100"/>
+              <w:bottom w:type="dxa" w:w="60"/>
+              <w:right w:type="dxa" w:w="100"/>
+            </w:tcMar>
+          </w:tcPr>
+          <w:p>
+            <w:r>
+              <w:t xml:space="preserve">v0.11、v0.12 与版本一一对应</w:t>
+            </w:r>
+          </w:p>
+        </w:tc>
+      </w:tr>
+    </w:tbl>
+    <w:p/>
+    <w:p/>
+    <w:p>
+      <w:r>
+        <w:rPr>
+          <w:b/>
+          <w:bCs/>
+        </w:rPr>
+        <w:t xml:space="preserve">E1 出口标准达成</w:t>
+      </w:r>
+      <w:r>
+        <w:t xml:space="preserve">：桌面包追平当时 Web 版；页面显示版本与基线日期；CI 跑通契约校验。</w:t>
+      </w:r>
+    </w:p>
+    <w:p/>
+    <w:p>
+      <w:r>
+        <w:rPr>
+          <w:b/>
+          <w:bCs/>
+        </w:rPr>
+        <w:t xml:space="preserve">桌面追平惯例</w:t>
+      </w:r>
+      <w:r>
+        <w:t xml:space="preserve">（写入 README）：Web 版累积 ≥2 个版本即重打桌面包；桌面版本号与 Web 对齐（Web v0.12 → 桌面 v0.12.0）。</w:t>
+      </w:r>
+    </w:p>
+    <w:p/>
+    <w:p>
+      <w:r>
+        <w:rPr>
+          <w:b/>
+          <w:bCs/>
+        </w:rPr>
+        <w:t xml:space="preserve">核实方法坑</w:t>
+      </w:r>
+      <w:r>
+        <w:t xml:space="preserve">：`@electron/asar extract-file` 不往 stdout 输出（它写文件到当前目录），</w:t>
+      </w:r>
+    </w:p>
+    <w:p>
+      <w:r>
+        <w:t xml:space="preserve">用它 grep 会得到"七项特性全部缺失"的假阴性。正确做法是 `asar extract` 解包到临时目录再 grep。</w:t>
       </w:r>
     </w:p>
     <w:p/>

</xml_diff>